<commit_message>
update 声遇诗经: fix rubric names, remove 齐读/创编, add flowchart diagram
</commit_message>
<xml_diff>
--- a/声遇诗经_修改版.docx
+++ b/声遇诗经_修改版.docx
@@ -53,7 +53,7 @@
           <w:b w:val="0"/>
           <w:sz w:val="24"/>
         </w:rPr>
-        <w:t>在我的《遇见诗经》校本课程中，共安排了8个学习活动，分别是经典初识、诵读习得、植物寻踪、生灵探秘、生活拾趣、情韵共鸣、手册创作、成果分享。本活动"声遇《诗经》·经典诵读会"是其中第2个（诵读习得），它在课程中处于基础技能夯实阶段，承接第1个活动"经典初识"中对《诗经》基础知识与生僻字词的初步认知，聚焦四言诗诵读技巧的习得与运用，是落实课程诵读能力培养目标的核心一课，为后续植物寻踪、生灵探秘等深度学习中的情感感受与意象理解筑牢语感基础。</w:t>
+        <w:t>在我的《遇见诗经》校本课程中，共安排了8个学习活动，依次是经典初识、诵读习得、植物寻踪、生灵探秘、生活拾趣、情韵共鸣、手册创作、成果分享。这8个活动遵循"知识积累—技能训练—意境感受—创意表达—整合呈现"的递进逻辑：前两个活动重在夯实基础（认识《诗经》、习得诵读技巧），中间四个活动从自然、生活、情感三个维度深入感受《诗经》意象，后两个活动引导学生将所学整合创作并公开分享。本活动"声遇《诗经》·经典诵读会"是其中第2个（诵读习得），承接经典初识中对《诗经》基础知识与生僻字词的初步认知，聚焦四言诗诵读技巧的专项习得，为后续各活动中情感感受与意象理解筑牢语感基础。</w:t>
       </w:r>
     </w:p>
     <w:p>
@@ -80,7 +80,7 @@
           <w:b w:val="0"/>
           <w:sz w:val="24"/>
         </w:rPr>
-        <w:t>任务一：习得诵读技巧——回顾并专项训练四言诗"二二停顿"节奏规律，掌握停顿、重音、语调三种诵读技巧，在《关雎》《桃夭》两首篇目中熟练运用。</w:t>
+        <w:t>任务一：习得诵读技巧——专项训练四言诗"二二停顿"节奏规律，掌握停顿、重音、语调三种诵读技巧，在《关雎》《桃夭》两首篇目中熟练运用。</w:t>
       </w:r>
     </w:p>
     <w:p>
@@ -108,7 +108,7 @@
           <w:b w:val="0"/>
           <w:sz w:val="24"/>
         </w:rPr>
-        <w:t>任务三：开展诵读展示与互评——举办班级诵读会，各小组依次展示成果，通过学生互评与教师点评，对照评价量规明确改进方向，评选优秀展示小组。</w:t>
+        <w:t>任务三：开展诵读展示与互评——举办班级诵读会，各小组依次展示成果，通过互评与教师点评，对照评价量规明确改进方向，评选优秀展示小组。</w:t>
       </w:r>
     </w:p>
     <w:p>
@@ -135,7 +135,7 @@
           <w:b w:val="0"/>
           <w:sz w:val="24"/>
         </w:rPr>
-        <w:t>在课程的前期学习中，学生已经学习了《诗经》的起源与"风、雅、颂"分类知识，认识了"雎鸠""蒹葭""荇菜"等20余个生僻字词，知道《诗经》是我国最早的诗歌总集，了解四言诗的基本节奏是"二二停顿"。会借助课下注释理解诗意，能进行简单的跟读模仿。还需要发展独立标注停顿与重音的能力、结合情感内容调整语调的技巧，以及在小组合作中协商设计展示方案的能力。</w:t>
+        <w:t>在前期学习中，学生已了解《诗经》起源与"风、雅、颂"分类知识，认识了20余个生僻字词，知道四言诗的基本节奏是"二二停顿"，能借助注释理解诗意，会进行简单的跟读模仿。还需要发展的能力：独立标注停顿与重音、结合情感调整语调，以及在小组合作中协商设计展示方案。</w:t>
       </w:r>
     </w:p>
     <w:p>
@@ -162,7 +162,7 @@
           <w:b w:val="0"/>
           <w:sz w:val="24"/>
         </w:rPr>
-        <w:t>本活动通过系统的诵读技巧训练与创意展示实践，让学生真切感受《诗经》的音韵美与节奏美，提升语言表达能力与审美鉴赏能力；在小组合作设计展示方案的过程中，培养团队协作意识与沟通能力；通过经典诵读实践，增强学生对中华优秀传统文化的认同感与传承意识。</w:t>
+        <w:t>本活动通过系统的诵读技巧训练与展示实践，让学生真切感受《诗经》的音韵之美，提升语言表达能力与审美鉴赏能力；在小组合作设计方案的过程中培养团队协作意识；通过经典诵读实践，增强对中华优秀传统文化的认同感与传承意识。</w:t>
       </w:r>
     </w:p>
     <w:p>
@@ -202,7 +202,7 @@
           <w:b w:val="0"/>
           <w:sz w:val="24"/>
         </w:rPr>
-        <w:t>通过诵读技巧专项练习、小组合作设计展示方案与班级诵读展示活动，体验《诗经》四言诗独特的韵律之美，学会运用停顿、重音、语调技巧有感情地诵读《关雎》《桃夭》两首核心篇目，树立对中华传统文化的自信心与传承意识。</w:t>
+        <w:t>通过诵读技巧专项练习、小组合作设计展示方案与班级诵读展示，体验《诗经》四言诗独特的韵律之美，学会运用停顿、重音、语调技巧有感情地诵读《关雎》《桃夭》，树立对中华传统文化的自信心与传承意识。</w:t>
       </w:r>
     </w:p>
     <w:p>
@@ -229,7 +229,7 @@
           <w:b w:val="0"/>
           <w:sz w:val="24"/>
         </w:rPr>
-        <w:t>为了达成预期的学习目标，学生需要重点学习四言诗"二二停顿"的节奏规律，掌握重音标注与语调变化的正确运用方法，能够在诵读中将技巧与情感融合表达。</w:t>
+        <w:t>重点：四言诗"二二停顿"的节奏规律，停顿、重音、语调三种诵读技巧的正确运用。</w:t>
       </w:r>
     </w:p>
     <w:p>
@@ -243,7 +243,7 @@
           <w:b w:val="0"/>
           <w:sz w:val="24"/>
         </w:rPr>
-        <w:t>学生在学习过程中，可能面临的困难有：难以将"二二停顿"节奏规律自动化运用，容易回到散文式阅读节奏；难以结合诗歌意象把握情感基调，不会通过语调变化传递诗歌情感；小组设计展示方案时形式单一，缺乏创意；部分学生上台展示时紧张，影响诵读效果。</w:t>
+        <w:t>难点：将"二二停顿"节奏规律自动化运用，避免退回散文式阅读节奏；结合诗歌意象把握情感基调，通过语调变化传递情感；小组展示时各角色配合自然流畅。</w:t>
       </w:r>
     </w:p>
     <w:p>
@@ -514,7 +514,7 @@
           <w:b w:val="0"/>
           <w:sz w:val="24"/>
         </w:rPr>
-        <w:t>任务一：【诵读技巧掌握评价表】——针对停顿、重音、字音三个维度，用于任务一结束时学生自评与同桌互评。</w:t>
+        <w:t>任务一：【评诵读技巧】——针对停顿、重音、字音三个维度，用于任务一结束时学生自评与同桌互评。</w:t>
       </w:r>
     </w:p>
     <w:p>
@@ -528,7 +528,7 @@
           <w:b w:val="0"/>
           <w:sz w:val="24"/>
         </w:rPr>
-        <w:t>任务二：【小组方案设计评价表】——针对分工明确性、技巧运用、合作态度三个维度，用于任务二结束时小组自评。</w:t>
+        <w:t>任务二：【评展示方案】——针对分工明确性、技巧运用、合作态度三个维度，用于任务二结束时小组自评。</w:t>
       </w:r>
     </w:p>
     <w:p>
@@ -542,7 +542,7 @@
           <w:b w:val="0"/>
           <w:sz w:val="24"/>
         </w:rPr>
-        <w:t>任务三：【诵读展示评价量规】——针对诵读技巧、情感表达、团队配合、展示创意四个维度，用于任务三展示时互评与教师评价。</w:t>
+        <w:t>任务三：【评诵读展示】——针对诵读技巧、情感表达、团队配合、展示创意四个维度，用于任务三展示时互评与教师评价。</w:t>
       </w:r>
     </w:p>
     <w:p>
@@ -556,7 +556,7 @@
           <w:b/>
           <w:sz w:val="22"/>
         </w:rPr>
-        <w:t>【诵读技巧掌握评价表】（任务一）</w:t>
+        <w:t>【评诵读技巧】（任务一评价量规）</w:t>
       </w:r>
     </w:p>
     <w:tbl>
@@ -585,7 +585,7 @@
               <w:rPr>
                 <w:rFonts w:ascii="宋体" w:hAnsi="宋体" w:eastAsia="宋体"/>
                 <w:b/>
-                <w:sz w:val="22"/>
+                <w:sz w:val="20"/>
               </w:rPr>
               <w:t>评价维度</w:t>
             </w:r>
@@ -602,7 +602,7 @@
               <w:rPr>
                 <w:rFonts w:ascii="宋体" w:hAnsi="宋体" w:eastAsia="宋体"/>
                 <w:b/>
-                <w:sz w:val="22"/>
+                <w:sz w:val="20"/>
               </w:rPr>
               <w:t>三星（优秀）</w:t>
             </w:r>
@@ -619,7 +619,7 @@
               <w:rPr>
                 <w:rFonts w:ascii="宋体" w:hAnsi="宋体" w:eastAsia="宋体"/>
                 <w:b/>
-                <w:sz w:val="22"/>
+                <w:sz w:val="20"/>
               </w:rPr>
               <w:t>二星（良好）</w:t>
             </w:r>
@@ -636,7 +636,7 @@
               <w:rPr>
                 <w:rFonts w:ascii="宋体" w:hAnsi="宋体" w:eastAsia="宋体"/>
                 <w:b/>
-                <w:sz w:val="22"/>
+                <w:sz w:val="20"/>
               </w:rPr>
               <w:t>一星（待改进）</w:t>
             </w:r>
@@ -653,7 +653,7 @@
               <w:rPr>
                 <w:rFonts w:ascii="宋体" w:hAnsi="宋体" w:eastAsia="宋体"/>
                 <w:b/>
-                <w:sz w:val="22"/>
+                <w:sz w:val="20"/>
               </w:rPr>
               <w:t>自评</w:t>
             </w:r>
@@ -670,7 +670,7 @@
               <w:rPr>
                 <w:rFonts w:ascii="宋体" w:hAnsi="宋体" w:eastAsia="宋体"/>
                 <w:b/>
-                <w:sz w:val="22"/>
+                <w:sz w:val="20"/>
               </w:rPr>
               <w:t>互评</w:t>
             </w:r>
@@ -978,7 +978,7 @@
           <w:b/>
           <w:sz w:val="22"/>
         </w:rPr>
-        <w:t>【小组方案设计评价表】（任务二）</w:t>
+        <w:t>【评展示方案】（任务二评价量规）</w:t>
       </w:r>
     </w:p>
     <w:tbl>
@@ -1006,7 +1006,7 @@
               <w:rPr>
                 <w:rFonts w:ascii="宋体" w:hAnsi="宋体" w:eastAsia="宋体"/>
                 <w:b/>
-                <w:sz w:val="22"/>
+                <w:sz w:val="20"/>
               </w:rPr>
               <w:t>评价维度</w:t>
             </w:r>
@@ -1023,7 +1023,7 @@
               <w:rPr>
                 <w:rFonts w:ascii="宋体" w:hAnsi="宋体" w:eastAsia="宋体"/>
                 <w:b/>
-                <w:sz w:val="22"/>
+                <w:sz w:val="20"/>
               </w:rPr>
               <w:t>三星（优秀）</w:t>
             </w:r>
@@ -1040,7 +1040,7 @@
               <w:rPr>
                 <w:rFonts w:ascii="宋体" w:hAnsi="宋体" w:eastAsia="宋体"/>
                 <w:b/>
-                <w:sz w:val="22"/>
+                <w:sz w:val="20"/>
               </w:rPr>
               <w:t>二星（良好）</w:t>
             </w:r>
@@ -1057,7 +1057,7 @@
               <w:rPr>
                 <w:rFonts w:ascii="宋体" w:hAnsi="宋体" w:eastAsia="宋体"/>
                 <w:b/>
-                <w:sz w:val="22"/>
+                <w:sz w:val="20"/>
               </w:rPr>
               <w:t>一星（待改进）</w:t>
             </w:r>
@@ -1074,7 +1074,7 @@
               <w:rPr>
                 <w:rFonts w:ascii="宋体" w:hAnsi="宋体" w:eastAsia="宋体"/>
                 <w:b/>
-                <w:sz w:val="22"/>
+                <w:sz w:val="20"/>
               </w:rPr>
               <w:t>组内自评</w:t>
             </w:r>
@@ -1337,7 +1337,7 @@
           <w:b/>
           <w:sz w:val="22"/>
         </w:rPr>
-        <w:t>【诵读展示评价量规】（任务三）</w:t>
+        <w:t>【评诵读展示】（任务三评价量规）</w:t>
       </w:r>
     </w:p>
     <w:tbl>
@@ -1365,7 +1365,7 @@
               <w:rPr>
                 <w:rFonts w:ascii="宋体" w:hAnsi="宋体" w:eastAsia="宋体"/>
                 <w:b/>
-                <w:sz w:val="22"/>
+                <w:sz w:val="20"/>
               </w:rPr>
               <w:t>评价维度</w:t>
             </w:r>
@@ -1382,7 +1382,7 @@
               <w:rPr>
                 <w:rFonts w:ascii="宋体" w:hAnsi="宋体" w:eastAsia="宋体"/>
                 <w:b/>
-                <w:sz w:val="22"/>
+                <w:sz w:val="20"/>
               </w:rPr>
               <w:t>三星（优秀）</w:t>
             </w:r>
@@ -1399,7 +1399,7 @@
               <w:rPr>
                 <w:rFonts w:ascii="宋体" w:hAnsi="宋体" w:eastAsia="宋体"/>
                 <w:b/>
-                <w:sz w:val="22"/>
+                <w:sz w:val="20"/>
               </w:rPr>
               <w:t>二星（良好）</w:t>
             </w:r>
@@ -1416,7 +1416,7 @@
               <w:rPr>
                 <w:rFonts w:ascii="宋体" w:hAnsi="宋体" w:eastAsia="宋体"/>
                 <w:b/>
-                <w:sz w:val="22"/>
+                <w:sz w:val="20"/>
               </w:rPr>
               <w:t>一星（待改进）</w:t>
             </w:r>
@@ -1433,7 +1433,7 @@
               <w:rPr>
                 <w:rFonts w:ascii="宋体" w:hAnsi="宋体" w:eastAsia="宋体"/>
                 <w:b/>
-                <w:sz w:val="22"/>
+                <w:sz w:val="20"/>
               </w:rPr>
               <w:t>互评</w:t>
             </w:r>
@@ -1781,58 +1781,41 @@
     </w:p>
     <w:p>
       <w:pPr>
-        <w:spacing w:after="40"/>
-        <w:ind w:firstLine="480"/>
+        <w:jc w:val="center"/>
       </w:pPr>
       <w:r>
-        <w:rPr>
-          <w:rFonts w:ascii="宋体" w:hAnsi="宋体" w:eastAsia="宋体"/>
-          <w:b w:val="0"/>
-          <w:sz w:val="24"/>
-        </w:rPr>
-        <w:t>核心驱动问题：怎样用声音读出《诗经》的美？</w:t>
-      </w:r>
-    </w:p>
-    <w:p>
-      <w:pPr>
-        <w:spacing w:after="40"/>
-        <w:ind w:firstLine="480"/>
-      </w:pPr>
-      <w:r>
-        <w:rPr>
-          <w:rFonts w:ascii="宋体" w:hAnsi="宋体" w:eastAsia="宋体"/>
-          <w:b w:val="0"/>
-          <w:sz w:val="24"/>
-        </w:rPr>
-        <w:t>→ 任务一：习得诵读技巧（教师示范对比→跟读练习→结对互练→齐读巩固）→【诵读技巧掌握评价表】</w:t>
-      </w:r>
-    </w:p>
-    <w:p>
-      <w:pPr>
-        <w:spacing w:after="40"/>
-        <w:ind w:firstLine="480"/>
-      </w:pPr>
-      <w:r>
-        <w:rPr>
-          <w:rFonts w:ascii="宋体" w:hAnsi="宋体" w:eastAsia="宋体"/>
-          <w:b w:val="0"/>
-          <w:sz w:val="24"/>
-        </w:rPr>
-        <w:t>→ 任务二：设计诵读展示方案（观看示范→小组讨论→填写分工表→自主排练）→【小组方案设计评价表】</w:t>
-      </w:r>
-    </w:p>
-    <w:p>
-      <w:pPr>
-        <w:spacing w:after="40"/>
-        <w:ind w:firstLine="480"/>
-      </w:pPr>
-      <w:r>
-        <w:rPr>
-          <w:rFonts w:ascii="宋体" w:hAnsi="宋体" w:eastAsia="宋体"/>
-          <w:b w:val="0"/>
-          <w:sz w:val="24"/>
-        </w:rPr>
-        <w:t>→ 任务三：开展诵读展示与互评（抽签出场→小组展示→互评点评→评选优秀）→【诵读展示评价量规】</w:t>
+        <w:drawing>
+          <wp:inline xmlns:a="http://schemas.openxmlformats.org/drawingml/2006/main" xmlns:pic="http://schemas.openxmlformats.org/drawingml/2006/picture">
+            <wp:extent cx="5400000" cy="6241263"/>
+            <wp:docPr id="1" name="Picture 1"/>
+            <wp:cNvGraphicFramePr>
+              <a:graphicFrameLocks noChangeAspect="1"/>
+            </wp:cNvGraphicFramePr>
+            <a:graphic>
+              <a:graphicData uri="http://schemas.openxmlformats.org/drawingml/2006/picture">
+                <pic:pic>
+                  <pic:nvPicPr>
+                    <pic:cNvPr id="0" name="image.png"/>
+                    <pic:cNvPicPr/>
+                  </pic:nvPicPr>
+                  <pic:blipFill>
+                    <a:blip r:embed="rId9"/>
+                    <a:stretch>
+                      <a:fillRect/>
+                    </a:stretch>
+                  </pic:blipFill>
+                  <pic:spPr>
+                    <a:xfrm>
+                      <a:off x="0" y="0"/>
+                      <a:ext cx="5400000" cy="6241263"/>
+                    </a:xfrm>
+                    <a:prstGeom prst="rect"/>
+                  </pic:spPr>
+                </pic:pic>
+              </a:graphicData>
+            </a:graphic>
+          </wp:inline>
+        </w:drawing>
       </w:r>
     </w:p>
     <w:p>
@@ -1956,7 +1939,7 @@
           <w:b w:val="0"/>
           <w:sz w:val="24"/>
         </w:rPr>
-        <w:t>（1）自由朗读《关雎》《桃夭》，对照《诗经阅读手册》，用铅笔圈出自己读不准的字词。注意事项：轻声朗读，不影响他人，遇到拿不准的字先做标记，不要跳过。</w:t>
+        <w:t>（1）自由轻声诵读《关雎》《桃夭》，对照《诗经阅读手册》，用铅笔圈出自己读不准的字词。注意事项：轻声诵读，不影响他人，遇到拿不准的字先做标记，不要跳过。</w:t>
       </w:r>
     </w:p>
     <w:p>
@@ -1984,7 +1967,7 @@
           <w:b w:val="0"/>
           <w:sz w:val="24"/>
         </w:rPr>
-        <w:t>（3）听教师逐句示范重音与语调：以《关雎》第一章为例，讲解叠词重读方法与语调处理，学生用"·"标注重音。注意事项：重音不是大声，是加强语气，标完后轻声跟读感受效果。</w:t>
+        <w:t>（3）听教师逐句示范重音与语调：以《关雎》第一章为例，讲解叠词重读方法与语调处理，学生用"·"标注重音。注意事项：重音不是大声，是加强语气，标完后轻声跟诵感受效果。</w:t>
       </w:r>
     </w:p>
     <w:p>
@@ -1998,7 +1981,7 @@
           <w:b w:val="0"/>
           <w:sz w:val="24"/>
         </w:rPr>
-        <w:t>（4）跟读练习：教师领读《关雎》第一章，学生跟读3遍——第一遍专注停顿，第二遍专注重音，第三遍专注语调变化。注意事项：每遍侧重点不同，不要三遍以同样方式读。</w:t>
+        <w:t>（4）跟诵练习：教师领诵《关雎》第一章，学生跟诵3遍——第一遍专注停顿，第二遍专注重音，第三遍专注语调变化。注意事项：每遍侧重点不同，不要三遍以同样方式诵读。</w:t>
       </w:r>
     </w:p>
     <w:p>
@@ -2012,21 +1995,7 @@
           <w:b w:val="0"/>
           <w:sz w:val="24"/>
         </w:rPr>
-        <w:t>（5）结对互练：和同桌各自诵读《桃夭》，互相倾听，指出对方字音错误或节奏偏差，每人至少完整读2遍。注意事项：指出问题要具体，如「之子于归你归字读轻了」，不能只说「你读错了」。</w:t>
-      </w:r>
-    </w:p>
-    <w:p>
-      <w:pPr>
-        <w:spacing w:after="40"/>
-        <w:ind w:firstLine="480"/>
-      </w:pPr>
-      <w:r>
-        <w:rPr>
-          <w:rFonts w:ascii="宋体" w:hAnsi="宋体" w:eastAsia="宋体"/>
-          <w:b w:val="0"/>
-          <w:sz w:val="24"/>
-        </w:rPr>
-        <w:t>（6）全班有节奏地齐读《关雎》《桃夭》，整体感受诵读效果。注意事项：齐读时保持统一节奏，不抢拍不拖拍。</w:t>
+        <w:t>（5）结对互练：和同桌各自诵读《桃夭》，互相倾听，指出对方字音错误或节奏偏差，每人至少完整诵读2遍。注意事项：指出问题要具体，如「之子于归的归字你读轻了」，不能只说「你读错了」。</w:t>
       </w:r>
     </w:p>
     <w:p>
@@ -2066,7 +2035,7 @@
               <w:rPr>
                 <w:rFonts w:ascii="宋体" w:hAnsi="宋体" w:eastAsia="宋体"/>
                 <w:b/>
-                <w:sz w:val="22"/>
+                <w:sz w:val="20"/>
               </w:rPr>
               <w:t>问题预设</w:t>
             </w:r>
@@ -2083,7 +2052,7 @@
               <w:rPr>
                 <w:rFonts w:ascii="宋体" w:hAnsi="宋体" w:eastAsia="宋体"/>
                 <w:b/>
-                <w:sz w:val="22"/>
+                <w:sz w:val="20"/>
               </w:rPr>
               <w:t>解决方法1</w:t>
             </w:r>
@@ -2100,7 +2069,7 @@
               <w:rPr>
                 <w:rFonts w:ascii="宋体" w:hAnsi="宋体" w:eastAsia="宋体"/>
                 <w:b/>
-                <w:sz w:val="22"/>
+                <w:sz w:val="20"/>
               </w:rPr>
               <w:t>解决方法2</w:t>
             </w:r>
@@ -2136,7 +2105,7 @@
                 <w:b w:val="0"/>
                 <w:sz w:val="20"/>
               </w:rPr>
-              <w:t>把易错字写黑板标拼音，带领齐读3遍</w:t>
+              <w:t>把易错字写黑板标拼音，带领逐字诵读</w:t>
             </w:r>
           </w:p>
         </w:tc>
@@ -2202,7 +2171,7 @@
                 <w:b w:val="0"/>
                 <w:sz w:val="20"/>
               </w:rPr>
-              <w:t>让掌握好的学生当"小老师"带读</w:t>
+              <w:t>让掌握好的学生当"小老师"带诵</w:t>
             </w:r>
           </w:p>
         </w:tc>
@@ -2270,7 +2239,7 @@
                 <w:b w:val="0"/>
                 <w:sz w:val="20"/>
               </w:rPr>
-              <w:t>全班齐读节奏不统一</w:t>
+              <w:t>结对互练时反馈笼统</w:t>
             </w:r>
           </w:p>
         </w:tc>
@@ -2286,7 +2255,7 @@
                 <w:b w:val="0"/>
                 <w:sz w:val="20"/>
               </w:rPr>
-              <w:t>教师举手示意放慢，重新从第一句领读</w:t>
+              <w:t>教师示范反馈语言：从停顿/重音/字音具体指出</w:t>
             </w:r>
           </w:p>
         </w:tc>
@@ -2302,7 +2271,7 @@
                 <w:b w:val="0"/>
                 <w:sz w:val="20"/>
               </w:rPr>
-              <w:t>指定节奏感强的学生领读，其他人跟读</w:t>
+              <w:t>要求学生用"你第X句的X字……"句式反馈</w:t>
             </w:r>
           </w:p>
         </w:tc>
@@ -2334,7 +2303,7 @@
           <w:b w:val="0"/>
           <w:sz w:val="24"/>
         </w:rPr>
-        <w:t>（1）指导重点：突破"二二停顿"自动化运用难点。对比示范：先用散文式平读，再用标准二二停顿诵读，让学生感受两者差异——四言诗有其独特节奏规律，不同于五七言古诗；拍手辅助：带领学生边拍手边读"关关（拍）雎鸠（拍）在河（拍）之洲（拍）"，用身体节奏固化停顿规律；即时纠正：巡视时发现节奏问题，轻声示范正确节奏，不打断全班进度。</w:t>
+        <w:t>（1）指导重点：突破"二二停顿"自动化运用难点。对比示范：先用散文式平读，再用标准二二停顿诵读，让学生感受两者差异；拍手辅助：带领学生边拍手边诵"关关（拍）雎鸠（拍）在河（拍）之洲（拍）"，用身体节奏固化停顿规律；即时纠正：巡视时发现节奏问题，轻声示范正确节奏，不打断全班进度。</w:t>
       </w:r>
     </w:p>
     <w:p>
@@ -2348,7 +2317,7 @@
           <w:b w:val="0"/>
           <w:sz w:val="24"/>
         </w:rPr>
-        <w:t>（2）指导重点：引导学生用语调传递情感。情境导入："《关雎》里的男子在想念谁？他是什么心情？你要用什么声音才能让大家感受到？"引发学生思考情感与语调的关系；分层指导：对语调变化困难的学生，提示"想象你就是那个在河边看到心仪姑娘的男孩，轻柔地读出那种期盼与喜悦"。</w:t>
+        <w:t>（2）指导重点：引导学生用语调传递情感。情境导入："《关雎》里的男子在想念谁？他是什么心情？你要用什么声音才能让大家感受到？"引发学生思考情感与语调的关系；分层指导：对语调变化困难的学生，提示"想象你就是那个在河边看到心仪姑娘的男孩，轻柔地诵出那种期盼与喜悦"。</w:t>
       </w:r>
     </w:p>
     <w:p>
@@ -2376,7 +2345,7 @@
           <w:b w:val="0"/>
           <w:sz w:val="24"/>
         </w:rPr>
-        <w:t>任务一结束时，使用【诵读技巧掌握评价表】，学生先自评，再同桌互评，教师抽查2-3组反馈共性问题，确认大部分学生掌握"二二停顿"节奏后进入任务二。</w:t>
+        <w:t>任务一结束时，使用【评诵读技巧】量规，学生先自评，再同桌互评，教师抽查2-3组反馈共性问题，确认大部分学生掌握"二二停顿"节奏后进入任务二。</w:t>
       </w:r>
     </w:p>
     <w:p>
@@ -2417,7 +2386,7 @@
           <w:b w:val="0"/>
           <w:sz w:val="24"/>
         </w:rPr>
-        <w:t>主要任务：以4-5人为一组，结合《关雎》《桃夭》的诗歌内容与任务一习得的诵读技巧，讨论并设计个性化的诵读展示形式（如领读+齐诵、分角色轮读、配乐诵读等），明确每位成员的具体分工，完成小组排练。解决的问题：解决学生展示形式单一、分工不明确、排练无序的问题，让每位成员都有明确角色。方法：通过教师提供形式参考、小组讨论填写分工表、自主排练的方式完成方案设计。</w:t>
+        <w:t>主要任务：以4-5人为一组，结合《关雎》《桃夭》的诗歌内容与任务一习得的诵读技巧，讨论并设计个性化的诵读展示形式（如领诵+分声部接诵、男女声分诵、配乐诵读等），明确每位成员的具体分工，完成小组排练。解决的问题：解决学生展示形式单一、分工不明确、排练无序的问题。方法：通过教师提供形式参考、小组讨论填写分工表、自主排练的方式完成方案设计。</w:t>
       </w:r>
     </w:p>
     <w:p>
@@ -2487,7 +2456,7 @@
           <w:b w:val="0"/>
           <w:sz w:val="24"/>
         </w:rPr>
-        <w:t>（1）观看教师提供的1分钟优秀诵读展示片段，观察其展示形式与分工方式，记录1-2个可借鉴的亮点。注意事项：边看边想"我们组可以用哪种方式"，是为了获得启发，不是为了模仿。</w:t>
+        <w:t>（1）观看教师提供的1分钟优秀诵读展示片段，观察其展示形式与分工方式，记录1-2个可借鉴的亮点。注意事项：是为了获得启发，不是为了照搬模仿。</w:t>
       </w:r>
     </w:p>
     <w:p>
@@ -2501,7 +2470,7 @@
           <w:b w:val="0"/>
           <w:sz w:val="24"/>
         </w:rPr>
-        <w:t>（2）小组讨论：组长主持，讨论本组选择哪首诗（《关雎》或《桃夭》）、选用什么展示形式，可参考：领读+全组齐诵、分角色轮读、配乐诵读、男女声分读等。注意事项：每人都要发言，不能只有组长说，声音不要太大影响其他组。</w:t>
+        <w:t>（2）小组讨论：组长主持，讨论本组选择哪首诗（《关雎》或《桃夭》）、选用什么展示形式，可参考：领诵+全组接诵、分角色轮诵、男女声分诵、配乐诵读等。注意事项：每人都要发言，不能只有组长说，声音不要太大影响其他组。</w:t>
       </w:r>
     </w:p>
     <w:p>
@@ -2515,7 +2484,7 @@
           <w:b w:val="0"/>
           <w:sz w:val="24"/>
         </w:rPr>
-        <w:t>（3）填写《小组分工表》：明确展示诗目、展示形式、每位成员的具体段落或角色。注意事项：分工要具体到每个人，写清楚"谁读哪句/哪段"，不能写"大家一起读"。</w:t>
+        <w:t>（3）填写《小组分工表》：明确展示诗目、展示形式、每位成员的具体段落或角色。注意事项：分工要具体到每个人，写清楚"谁诵哪句/哪段"，不能写"大家一起"。</w:t>
       </w:r>
     </w:p>
     <w:p>
@@ -2569,7 +2538,7 @@
               <w:rPr>
                 <w:rFonts w:ascii="宋体" w:hAnsi="宋体" w:eastAsia="宋体"/>
                 <w:b/>
-                <w:sz w:val="22"/>
+                <w:sz w:val="20"/>
               </w:rPr>
               <w:t>问题预设</w:t>
             </w:r>
@@ -2586,7 +2555,7 @@
               <w:rPr>
                 <w:rFonts w:ascii="宋体" w:hAnsi="宋体" w:eastAsia="宋体"/>
                 <w:b/>
-                <w:sz w:val="22"/>
+                <w:sz w:val="20"/>
               </w:rPr>
               <w:t>解决方法1</w:t>
             </w:r>
@@ -2603,7 +2572,7 @@
               <w:rPr>
                 <w:rFonts w:ascii="宋体" w:hAnsi="宋体" w:eastAsia="宋体"/>
                 <w:b/>
-                <w:sz w:val="22"/>
+                <w:sz w:val="20"/>
               </w:rPr>
               <w:t>解决方法2</w:t>
             </w:r>
@@ -2639,7 +2608,7 @@
                 <w:b w:val="0"/>
                 <w:sz w:val="20"/>
               </w:rPr>
-              <w:t>教师提示组长按特长分工：声音好的领读，普通话准的纠音</w:t>
+              <w:t>教师提示组长按特长分工：声音好的领诵，普通话准的纠音</w:t>
             </w:r>
           </w:p>
         </w:tc>
@@ -2673,7 +2642,7 @@
                 <w:b w:val="0"/>
                 <w:sz w:val="20"/>
               </w:rPr>
-              <w:t>想不出展示形式，只会齐读</w:t>
+              <w:t>想不出展示形式，只想全体一起诵</w:t>
             </w:r>
           </w:p>
         </w:tc>
@@ -2689,7 +2658,7 @@
                 <w:b w:val="0"/>
                 <w:sz w:val="20"/>
               </w:rPr>
-              <w:t>教师提供"形式菜单"卡片，列出4种可选形式</w:t>
+              <w:t>教师提供"形式参考卡"，列出4种可选形式</w:t>
             </w:r>
           </w:p>
         </w:tc>
@@ -2705,7 +2674,7 @@
                 <w:b w:val="0"/>
                 <w:sz w:val="20"/>
               </w:rPr>
-              <w:t>教师口头举例："男生读上句，女生读下句，最后一起读"</w:t>
+              <w:t>教师口头举例："男生诵上句，女生诵下句，最后一起结尾"</w:t>
             </w:r>
           </w:p>
         </w:tc>
@@ -2787,7 +2756,7 @@
           <w:b w:val="0"/>
           <w:sz w:val="24"/>
         </w:rPr>
-        <w:t>（1）指导重点：帮助各组细化分工，确保每人都有实质参与。巡视各组，重点关注分工表是否具体；对分工笼统的组追问"你具体读哪一句"，引导细化到具体段落；对只选齐读的组，提示"能不能加一个领读，或者男女声分开试试"，提供方向但不替学生决定。</w:t>
+        <w:t>（1）指导重点：帮助各组细化分工，确保每人都有实质参与。巡视各组，重点关注分工表是否具体；对分工笼统的组追问"你具体诵哪一句"，引导细化到具体段落；对只选全员一起诵的组，提示"能不能加一个领诵，或者男女声分开试试"，提供方向但不替学生决定。</w:t>
       </w:r>
     </w:p>
     <w:p>
@@ -2829,7 +2798,7 @@
           <w:b w:val="0"/>
           <w:sz w:val="24"/>
         </w:rPr>
-        <w:t>任务二结束时，使用【小组方案设计评价表】，由组长带领本组成员自评分工合理性，教师快速确认各组每人都有具体分工后进入任务三。</w:t>
+        <w:t>任务二结束时，使用【评展示方案】量规，由组长带领本组成员自评分工合理性，教师快速确认各组每人都有具体分工后进入任务三。</w:t>
       </w:r>
     </w:p>
     <w:p>
@@ -2870,7 +2839,7 @@
           <w:b w:val="0"/>
           <w:sz w:val="24"/>
         </w:rPr>
-        <w:t>主要任务：各小组依次上台展示诵读成果，台下学生对照【诵读展示评价量规】进行小组评价，每组展示结束后完成互评反馈，教师点评并汇总共性问题，评选优秀展示小组。解决的问题：解决学生评价只会说"好""不好"、不会依据维度具体评价的问题；解决展示顺序混乱、时间失控的问题。方法：抽签确定展示顺序，使用量规引导结构化互评，教师示范评价语言。</w:t>
+        <w:t>主要任务：各小组依次上台展示诵读成果，台下学生对照【评诵读展示】量规进行小组评价，每组展示结束后完成互评反馈，教师点评并汇总共性问题，评选优秀展示小组。解决的问题：解决学生评价只会说"好""不好"、不会依据维度具体评价的问题；解决展示顺序混乱、时间失控的问题。方法：抽签确定展示顺序，使用量规引导结构化互评，教师示范评价语言。</w:t>
       </w:r>
     </w:p>
     <w:p>
@@ -2954,7 +2923,7 @@
           <w:b w:val="0"/>
           <w:sz w:val="24"/>
         </w:rPr>
-        <w:t>（2）展示组上台诵读，台下同学认真倾听，对照【诵读展示评价量规】对该组进行评分。注意事项：对照量规四个维度独立打星，不因喜好全打三星。</w:t>
+        <w:t>（2）展示组上台诵读，台下同学认真倾听，对照【评诵读展示】量规对该组进行评星。注意事项：对照量规四个维度独立打星，不因喜好全打三星。</w:t>
       </w:r>
     </w:p>
     <w:p>
@@ -2968,7 +2937,7 @@
           <w:b w:val="0"/>
           <w:sz w:val="24"/>
         </w:rPr>
-        <w:t>（3）每组展示结束后，台下推选1名同学依据量规反馈评价意见，用"我给你们×星，因为……"的句式表达。注意事项：反馈要具体，说出是哪个维度好或需改进，语气友善，不嘲笑。</w:t>
+        <w:t>（3）每组展示结束后，台下推选1名同学依据量规反馈评价意见，用"我给你们×星，因为……"的句式表达。注意事项：反馈要具体，说出是哪个维度好或需改进，语气友善。</w:t>
       </w:r>
     </w:p>
     <w:p>
@@ -3036,7 +3005,7 @@
               <w:rPr>
                 <w:rFonts w:ascii="宋体" w:hAnsi="宋体" w:eastAsia="宋体"/>
                 <w:b/>
-                <w:sz w:val="22"/>
+                <w:sz w:val="20"/>
               </w:rPr>
               <w:t>问题预设</w:t>
             </w:r>
@@ -3053,7 +3022,7 @@
               <w:rPr>
                 <w:rFonts w:ascii="宋体" w:hAnsi="宋体" w:eastAsia="宋体"/>
                 <w:b/>
-                <w:sz w:val="22"/>
+                <w:sz w:val="20"/>
               </w:rPr>
               <w:t>解决方法1</w:t>
             </w:r>
@@ -3070,7 +3039,7 @@
               <w:rPr>
                 <w:rFonts w:ascii="宋体" w:hAnsi="宋体" w:eastAsia="宋体"/>
                 <w:b/>
-                <w:sz w:val="22"/>
+                <w:sz w:val="20"/>
               </w:rPr>
               <w:t>解决方法2</w:t>
             </w:r>
@@ -3254,7 +3223,7 @@
           <w:b w:val="0"/>
           <w:sz w:val="24"/>
         </w:rPr>
-        <w:t>（1）指导重点：规范互评语言，提升评价质量。教师先做示范：「我观察到这组停顿很清晰，诵读技巧维度三星；但情感表达比较平淡，情感表达维度一星，建议下次窈窕淑女读得更柔和一些」；对评价笼统的学生追问好在量规哪个维度，引导对照量规细化。</w:t>
+        <w:t>（1）指导重点：规范互评语言，提升评价质量。教师先做示范：「我观察到这组停顿很清晰，诵读技巧维度三星；但情感表达比较平淡，情感表达维度一星，建议下次窈窕淑女诵得更柔和一些」；对评价笼统的学生追问好在量规哪个维度，引导对照量规细化。</w:t>
       </w:r>
     </w:p>
     <w:p>
@@ -3268,7 +3237,7 @@
           <w:b w:val="0"/>
           <w:sz w:val="24"/>
         </w:rPr>
-        <w:t>（2）指导重点：营造安全展示氛围。展示前告知规则：展示组在台上时台下保持安静，不嬉笑不插话，出现小失误不起哄；教师对紧张学生给予言语鼓励，不因紧张影响评分。</w:t>
+        <w:t>（2）指导重点：营造安全展示氛围。展示前告知规则：展示组在台上时台下保持安静，不嬉笑不插话，出现小失误不起哄；教师对紧张学生给予言语鼓励，不因紧张影响评分标准。</w:t>
       </w:r>
     </w:p>
     <w:p>
@@ -3296,7 +3265,7 @@
           <w:b w:val="0"/>
           <w:sz w:val="24"/>
         </w:rPr>
-        <w:t>任务三全程使用【诵读展示评价量规】，展示结束后当场统计各组得分，宣布优秀展示小组；课后学生将量规贴入《诗经阅读手册》作为过程性评价存档。</w:t>
+        <w:t>任务三全程使用【评诵读展示】量规，展示结束后当场统计各组得分，宣布优秀展示小组；课后学生将量规贴入《诗经阅读手册》作为过程性评价存档。</w:t>
       </w:r>
     </w:p>
     <w:p>
@@ -3336,7 +3305,7 @@
           <w:b w:val="0"/>
           <w:sz w:val="24"/>
         </w:rPr>
-        <w:t>基于我最近研究的"经典诵读与审美鉴赏"方向，在本次学习活动的指导中，我尝试通过"对比示范—技巧训练—创意展示"的递进结构，引导学生感受诵读的审美价值，效果反思待实践后补充。</w:t>
+        <w:t>基于我最近研究的"经典诵读与审美鉴赏"方向，本次活动尝试通过"对比示范—技巧训练—展示互评"的递进结构，引导学生感受诵读的审美价值，效果反思待实践后补充。</w:t>
       </w:r>
     </w:p>
     <w:p>
@@ -3363,7 +3332,7 @@
           <w:b w:val="0"/>
           <w:sz w:val="24"/>
         </w:rPr>
-        <w:t>本次学习活动，学生预期实现"诵读技巧习得"与"合作展示"两个目标，但"用语调表达情感"目标在35分钟内完全达成难度较大，反思是否需要在技巧训练环节增加情感体验活动。</w:t>
+        <w:t>本次活动预期实现"诵读技巧习得"与"合作展示"两个目标，但"用语调表达情感"目标在35分钟内完全达成难度较大，反思是否需要在技巧训练环节增加情感体验活动。</w:t>
       </w:r>
     </w:p>
     <w:p>
@@ -3390,7 +3359,7 @@
           <w:b w:val="0"/>
           <w:sz w:val="24"/>
         </w:rPr>
-        <w:t>我对传统文化教育有浓厚兴趣，在本次活动中尝试将背景音乐融入诵读展示，预计能提升学生对《诗经》意境的感受，实际效果待课后记录。</w:t>
+        <w:t>我对传统文化教育有浓厚兴趣，本次活动尝试将背景音乐融入诵读展示，预计能提升学生对《诗经》意境的感受，实际效果待课后记录。</w:t>
       </w:r>
     </w:p>
     <w:p>
@@ -3417,7 +3386,7 @@
           <w:b w:val="0"/>
           <w:sz w:val="24"/>
         </w:rPr>
-        <w:t>预设问题：部分学生在任务三展示时紧张影响发挥。预计采取的解决办法是：上台前提醒深呼吸，允许小组成员轻声提示节奏，教师全程给予鼓励眼神，不因紧张影响评分标准。效果反思待实践后补充。</w:t>
+        <w:t>预设问题：部分学生在任务三展示时紧张影响发挥。预计采取的解决办法：上台前提醒深呼吸，允许小组成员轻声提示节奏，教师全程给予鼓励眼神，不因紧张影响评分标准。效果反思待实践后补充。</w:t>
       </w:r>
     </w:p>
     <w:sectPr>

</xml_diff>